<commit_message>
Refactor selection process in StudentTopicController and SelectionChoiceDao
- Removed unused SystemConfigUtil import and intent limit logic from StudentTopicController.
- Updated intentCounts method to confirmedCounts in SelectionChoiceDao, reflecting changes in how topic selection counts are handled.
- Simplified SQL queries to improve performance and clarity, focusing on confirmed selections rather than pending intents.
- Added new SQL scripts for seeding test data and fixing encoding issues in review comments.
- Enhanced documentation in the project overview to clarify system design and functionality.
</commit_message>
<xml_diff>
--- a/前言.docx
+++ b/前言.docx
@@ -36,6 +36,7 @@
     <w:p>
       <w:pPr>
         <w:pStyle w:val="23"/>
+        <w:ind w:firstLine="480" w:firstLineChars="200"/>
         <w:rPr>
           <w:rFonts w:hint="default" w:ascii="Times New Roman" w:hAnsi="Times New Roman" w:eastAsia="SimHei" w:cs="Times New Roman"/>
         </w:rPr>
@@ -50,27 +51,16 @@
     <w:p>
       <w:pPr>
         <w:pStyle w:val="3"/>
-        <w:rPr>
-          <w:rFonts w:hint="default" w:ascii="Times New Roman" w:hAnsi="Times New Roman" w:eastAsia="SimHei" w:cs="Times New Roman"/>
-        </w:rPr>
-      </w:pPr>
-      <w:r>
-        <w:rPr>
-          <w:rFonts w:hint="default" w:ascii="Times New Roman" w:hAnsi="Times New Roman" w:eastAsia="SimHei" w:cs="Times New Roman"/>
-        </w:rPr>
-        <w:t>系统采用</w:t>
-      </w:r>
-      <w:r>
-        <w:rPr>
-          <w:rFonts w:hint="default" w:ascii="Times New Roman" w:hAnsi="Times New Roman" w:eastAsia="SimHei" w:cs="Times New Roman"/>
-        </w:rPr>
-        <w:t xml:space="preserve"> JSP + Servlet + JDBC + MySQL </w:t>
-      </w:r>
-      <w:r>
-        <w:rPr>
-          <w:rFonts w:hint="default" w:ascii="Times New Roman" w:hAnsi="Times New Roman" w:eastAsia="SimHei" w:cs="Times New Roman"/>
-        </w:rPr>
-        <w:t>技术路线，角色包括管理员、系主任、教师和学生。管理员负责基础数据、系统开关和全局管理；系主任负责本专业课题审核、选题兜底、评阅安排和答辩安排；教师负责课题发布、志愿审批、阶段材料审核和论文/答辩评分；学生负责填报志愿、提交材料并查看结果。</w:t>
+        <w:ind w:firstLine="480" w:firstLineChars="200"/>
+        <w:rPr>
+          <w:rFonts w:hint="default" w:ascii="Times New Roman" w:hAnsi="Times New Roman" w:eastAsia="SimHei" w:cs="Times New Roman"/>
+        </w:rPr>
+      </w:pPr>
+      <w:r>
+        <w:rPr>
+          <w:rFonts w:hint="default" w:ascii="Times New Roman" w:hAnsi="Times New Roman" w:eastAsia="SimHei" w:cs="Times New Roman"/>
+        </w:rPr>
+        <w:t>系统采用 JSP + Servlet + JDBC + MySQL 技术路线，角色包括管理员、系主任、教师和学生。管理员负责基础数据、系统开关和全局管理；系主任负责本专业课题审核、选题兜底、评阅安排和答辩安排；教师负责课题发布、志愿审批、阶段材料审核和论文/答辩评分；学生负责填报志愿、提交材料并查看结果。</w:t>
       </w:r>
     </w:p>
     <w:bookmarkEnd w:id="1"/>
@@ -138,31 +128,7 @@
         <w:rPr>
           <w:rFonts w:hint="default" w:ascii="Times New Roman" w:hAnsi="Times New Roman" w:eastAsia="SimHei" w:cs="Times New Roman"/>
         </w:rPr>
-        <w:t>学生每轮可以填报</w:t>
-      </w:r>
-      <w:r>
-        <w:rPr>
-          <w:rFonts w:hint="default" w:ascii="Times New Roman" w:hAnsi="Times New Roman" w:eastAsia="SimHei" w:cs="Times New Roman"/>
-        </w:rPr>
-        <w:t xml:space="preserve"> 1 </w:t>
-      </w:r>
-      <w:r>
-        <w:rPr>
-          <w:rFonts w:hint="default" w:ascii="Times New Roman" w:hAnsi="Times New Roman" w:eastAsia="SimHei" w:cs="Times New Roman"/>
-        </w:rPr>
-        <w:t>至</w:t>
-      </w:r>
-      <w:r>
-        <w:rPr>
-          <w:rFonts w:hint="default" w:ascii="Times New Roman" w:hAnsi="Times New Roman" w:eastAsia="SimHei" w:cs="Times New Roman"/>
-        </w:rPr>
-        <w:t xml:space="preserve"> 3 </w:t>
-      </w:r>
-      <w:r>
-        <w:rPr>
-          <w:rFonts w:hint="default" w:ascii="Times New Roman" w:hAnsi="Times New Roman" w:eastAsia="SimHei" w:cs="Times New Roman"/>
-        </w:rPr>
-        <w:t>个志愿。</w:t>
+        <w:t>学生每轮可以填报 1 至 3 个志愿。</w:t>
       </w:r>
     </w:p>
     <w:p>
@@ -198,19 +164,7 @@
         <w:rPr>
           <w:rFonts w:hint="default" w:ascii="Times New Roman" w:hAnsi="Times New Roman" w:eastAsia="SimHei" w:cs="Times New Roman"/>
         </w:rPr>
-        <w:t>每个课题每轮最多允许</w:t>
-      </w:r>
-      <w:r>
-        <w:rPr>
-          <w:rFonts w:hint="default" w:ascii="Times New Roman" w:hAnsi="Times New Roman" w:eastAsia="SimHei" w:cs="Times New Roman"/>
-        </w:rPr>
-        <w:t xml:space="preserve"> 3 </w:t>
-      </w:r>
-      <w:r>
-        <w:rPr>
-          <w:rFonts w:hint="default" w:ascii="Times New Roman" w:hAnsi="Times New Roman" w:eastAsia="SimHei" w:cs="Times New Roman"/>
-        </w:rPr>
-        <w:t>名学生表达意向。</w:t>
+        <w:t>每个课题每轮最多允许 3 名学生表达意向。</w:t>
       </w:r>
     </w:p>
     <w:p>
@@ -560,13 +514,7 @@
         <w:rPr>
           <w:rFonts w:hint="default" w:ascii="Times New Roman" w:hAnsi="Times New Roman" w:eastAsia="SimHei" w:cs="Times New Roman"/>
         </w:rPr>
-        <w:t>评阅教师评分作为毕业设计最终成绩的</w:t>
-      </w:r>
-      <w:r>
-        <w:rPr>
-          <w:rFonts w:hint="default" w:ascii="Times New Roman" w:hAnsi="Times New Roman" w:eastAsia="SimHei" w:cs="Times New Roman"/>
-        </w:rPr>
-        <w:t xml:space="preserve"> 20%。</w:t>
+        <w:t>评阅教师评分作为毕业设计最终成绩的 20%。</w:t>
       </w:r>
     </w:p>
     <w:p>
@@ -658,19 +606,7 @@
         <w:rPr>
           <w:rFonts w:hint="default" w:ascii="Times New Roman" w:hAnsi="Times New Roman" w:eastAsia="SimHei" w:cs="Times New Roman"/>
         </w:rPr>
-        <w:t>答辩均分达到</w:t>
-      </w:r>
-      <w:r>
-        <w:rPr>
-          <w:rFonts w:hint="default" w:ascii="Times New Roman" w:hAnsi="Times New Roman" w:eastAsia="SimHei" w:cs="Times New Roman"/>
-        </w:rPr>
-        <w:t xml:space="preserve"> 60 </w:t>
-      </w:r>
-      <w:r>
-        <w:rPr>
-          <w:rFonts w:hint="default" w:ascii="Times New Roman" w:hAnsi="Times New Roman" w:eastAsia="SimHei" w:cs="Times New Roman"/>
-        </w:rPr>
-        <w:t>分及以上视为答辩通过。</w:t>
+        <w:t>答辩均分达到 60 分及以上视为答辩通过。</w:t>
       </w:r>
     </w:p>
     <w:p>
@@ -751,63 +687,7 @@
           <w:rFonts w:hint="default" w:ascii="Times New Roman" w:hAnsi="Times New Roman" w:eastAsia="SimHei" w:cs="Times New Roman"/>
           <w:sz w:val="21"/>
         </w:rPr>
-        <w:t>最终成绩</w:t>
-      </w:r>
-      <w:r>
-        <w:rPr>
-          <w:rStyle w:val="48"/>
-          <w:rFonts w:hint="default" w:ascii="Times New Roman" w:hAnsi="Times New Roman" w:eastAsia="SimHei" w:cs="Times New Roman"/>
-          <w:sz w:val="21"/>
-        </w:rPr>
-        <w:t xml:space="preserve"> = </w:t>
-      </w:r>
-      <w:r>
-        <w:rPr>
-          <w:rStyle w:val="48"/>
-          <w:rFonts w:hint="default" w:ascii="Times New Roman" w:hAnsi="Times New Roman" w:eastAsia="SimHei" w:cs="Times New Roman"/>
-          <w:sz w:val="21"/>
-        </w:rPr>
-        <w:t>指导教师评分</w:t>
-      </w:r>
-      <w:r>
-        <w:rPr>
-          <w:rStyle w:val="48"/>
-          <w:rFonts w:hint="default" w:ascii="Times New Roman" w:hAnsi="Times New Roman" w:eastAsia="SimHei" w:cs="Times New Roman"/>
-          <w:sz w:val="21"/>
-        </w:rPr>
-        <w:t xml:space="preserve"> * 40% + </w:t>
-      </w:r>
-      <w:r>
-        <w:rPr>
-          <w:rStyle w:val="48"/>
-          <w:rFonts w:hint="default" w:ascii="Times New Roman" w:hAnsi="Times New Roman" w:eastAsia="SimHei" w:cs="Times New Roman"/>
-          <w:sz w:val="21"/>
-        </w:rPr>
-        <w:t>评阅教师评分</w:t>
-      </w:r>
-      <w:r>
-        <w:rPr>
-          <w:rStyle w:val="48"/>
-          <w:rFonts w:hint="default" w:ascii="Times New Roman" w:hAnsi="Times New Roman" w:eastAsia="SimHei" w:cs="Times New Roman"/>
-          <w:sz w:val="21"/>
-        </w:rPr>
-        <w:t xml:space="preserve"> * 20% + </w:t>
-      </w:r>
-      <w:r>
-        <w:rPr>
-          <w:rStyle w:val="48"/>
-          <w:rFonts w:hint="default" w:ascii="Times New Roman" w:hAnsi="Times New Roman" w:eastAsia="SimHei" w:cs="Times New Roman"/>
-          <w:sz w:val="21"/>
-        </w:rPr>
-        <w:t>答辩平均分</w:t>
-      </w:r>
-      <w:r>
-        <w:rPr>
-          <w:rStyle w:val="48"/>
-          <w:rFonts w:hint="default" w:ascii="Times New Roman" w:hAnsi="Times New Roman" w:eastAsia="SimHei" w:cs="Times New Roman"/>
-          <w:sz w:val="21"/>
-        </w:rPr>
-        <w:t xml:space="preserve"> * 40%</w:t>
+        <w:t>最终成绩 = 指导教师评分 * 40% + 评阅教师评分 * 20% + 答辩平均分 * 40%</w:t>
       </w:r>
     </w:p>
     <w:p>
@@ -885,15 +765,23 @@
     <w:p>
       <w:pPr>
         <w:pStyle w:val="23"/>
-        <w:rPr>
-          <w:rFonts w:hint="default" w:ascii="Times New Roman" w:hAnsi="Times New Roman" w:eastAsia="SimHei" w:cs="Times New Roman"/>
-        </w:rPr>
-      </w:pPr>
-      <w:r>
-        <w:rPr>
-          <w:rFonts w:hint="default" w:ascii="Times New Roman" w:hAnsi="Times New Roman" w:eastAsia="SimHei" w:cs="Times New Roman"/>
-        </w:rPr>
-        <w:t>前一版系统和报告以提交</w:t>
+        <w:ind w:firstLine="480" w:firstLineChars="200"/>
+        <w:rPr>
+          <w:rFonts w:hint="default" w:ascii="Times New Roman" w:hAnsi="Times New Roman" w:eastAsia="SimHei" w:cs="Times New Roman"/>
+        </w:rPr>
+      </w:pPr>
+      <w:r>
+        <w:rPr>
+          <w:rFonts w:hint="default" w:ascii="Times New Roman" w:hAnsi="Times New Roman" w:eastAsia="SimHei" w:cs="Times New Roman"/>
+        </w:rPr>
+        <w:t xml:space="preserve">前一版系统和报告以提交 </w:t>
+      </w:r>
+      <w:r>
+        <w:rPr>
+          <w:rStyle w:val="48"/>
+          <w:rFonts w:hint="default" w:ascii="Times New Roman" w:hAnsi="Times New Roman" w:eastAsia="SimHei" w:cs="Times New Roman"/>
+        </w:rPr>
+        <w:t>af66e11bdc20f60a90b20276332a14c38870a508</w:t>
       </w:r>
       <w:r>
         <w:rPr>
@@ -903,46 +791,76 @@
       </w:r>
       <w:r>
         <w:rPr>
-          <w:rStyle w:val="48"/>
-          <w:rFonts w:hint="default" w:ascii="Times New Roman" w:hAnsi="Times New Roman" w:eastAsia="SimHei" w:cs="Times New Roman"/>
-        </w:rPr>
-        <w:t>af66e11bdc20f60a90b20276332a14c38870a508</w:t>
-      </w:r>
-      <w:r>
-        <w:rPr>
-          <w:rFonts w:hint="default" w:ascii="Times New Roman" w:hAnsi="Times New Roman" w:eastAsia="SimHei" w:cs="Times New Roman"/>
-        </w:rPr>
-        <w:t xml:space="preserve"> </w:t>
-      </w:r>
-      <w:r>
-        <w:rPr>
-          <w:rFonts w:hint="default" w:ascii="Times New Roman" w:hAnsi="Times New Roman" w:eastAsia="SimHei" w:cs="Times New Roman"/>
-        </w:rPr>
-        <w:t>为基线。该版本已经具备基础的登录鉴权、课题管理、文档提交、答辩安排、统计导出、AI</w:t>
-      </w:r>
-      <w:r>
-        <w:rPr>
-          <w:rFonts w:hint="default" w:ascii="Times New Roman" w:hAnsi="Times New Roman" w:eastAsia="SimHei" w:cs="Times New Roman"/>
-        </w:rPr>
-        <w:t xml:space="preserve"> </w:t>
-      </w:r>
-      <w:r>
-        <w:rPr>
-          <w:rFonts w:hint="default" w:ascii="Times New Roman" w:hAnsi="Times New Roman" w:eastAsia="SimHei" w:cs="Times New Roman"/>
-        </w:rPr>
-        <w:t>辅助和部分角色隔离能力。该版本对毕业设计核心流程的表达不够完整，选题流程主要停留在“学生申请</w:t>
-      </w:r>
-      <w:r>
-        <w:rPr>
-          <w:rFonts w:hint="default" w:ascii="Times New Roman" w:hAnsi="Times New Roman" w:eastAsia="SimHei" w:cs="Times New Roman"/>
-        </w:rPr>
-        <w:t xml:space="preserve"> + </w:t>
-      </w:r>
-      <w:r>
-        <w:rPr>
-          <w:rFonts w:hint="default" w:ascii="Times New Roman" w:hAnsi="Times New Roman" w:eastAsia="SimHei" w:cs="Times New Roman"/>
-        </w:rPr>
-        <w:t>管理确认”或“一人一题审批”层面，三志愿、两轮、教师确认和流程控制体现不足。</w:t>
+          <w:rFonts w:hint="eastAsia" w:ascii="Times New Roman" w:hAnsi="Times New Roman" w:eastAsia="SimHei" w:cs="Times New Roman"/>
+          <w:lang w:eastAsia="zh-CN"/>
+        </w:rPr>
+        <w:t>（</w:t>
+      </w:r>
+      <w:r>
+        <w:rPr>
+          <w:rFonts w:hint="eastAsia" w:ascii="Times New Roman" w:hAnsi="Times New Roman" w:eastAsia="SimHei" w:cs="Times New Roman"/>
+          <w:color w:val="0B77A0" w:themeColor="accent4" w:themeShade="BF"/>
+          <w:u w:val="single"/>
+          <w:lang w:eastAsia="zh-CN"/>
+        </w:rPr>
+        <w:fldChar w:fldCharType="begin"/>
+      </w:r>
+      <w:r>
+        <w:rPr>
+          <w:rFonts w:hint="eastAsia" w:ascii="Times New Roman" w:hAnsi="Times New Roman" w:eastAsia="SimHei" w:cs="Times New Roman"/>
+          <w:color w:val="0B77A0" w:themeColor="accent4" w:themeShade="BF"/>
+          <w:u w:val="single"/>
+          <w:lang w:eastAsia="zh-CN"/>
+        </w:rPr>
+        <w:instrText xml:space="preserve"> HYPERLINK "https://github.com/guangxiangdebizi/graduation-design-management-system/commit/af66e11bdc20f60a90b20276332a14c38870a508" </w:instrText>
+      </w:r>
+      <w:r>
+        <w:rPr>
+          <w:rFonts w:hint="eastAsia" w:ascii="Times New Roman" w:hAnsi="Times New Roman" w:eastAsia="SimHei" w:cs="Times New Roman"/>
+          <w:color w:val="0B77A0" w:themeColor="accent4" w:themeShade="BF"/>
+          <w:u w:val="single"/>
+          <w:lang w:eastAsia="zh-CN"/>
+        </w:rPr>
+        <w:fldChar w:fldCharType="separate"/>
+      </w:r>
+      <w:r>
+        <w:rPr>
+          <w:rFonts w:hint="eastAsia" w:ascii="Times New Roman" w:hAnsi="Times New Roman" w:eastAsia="SimHei" w:cs="Times New Roman"/>
+          <w:color w:val="0B77A0" w:themeColor="accent4" w:themeShade="BF"/>
+          <w:u w:val="single"/>
+          <w:lang w:eastAsia="zh-CN"/>
+        </w:rPr>
+        <w:t>refactor project documentation and remove obsolete files · guangxiangdebizi/graduation-design-management-system@af66e11</w:t>
+      </w:r>
+      <w:r>
+        <w:rPr>
+          <w:rFonts w:hint="eastAsia" w:ascii="Times New Roman" w:hAnsi="Times New Roman" w:eastAsia="SimHei" w:cs="Times New Roman"/>
+          <w:color w:val="0B77A0" w:themeColor="accent4" w:themeShade="BF"/>
+          <w:u w:val="single"/>
+          <w:lang w:eastAsia="zh-CN"/>
+        </w:rPr>
+        <w:fldChar w:fldCharType="end"/>
+      </w:r>
+      <w:r>
+        <w:rPr>
+          <w:rFonts w:hint="eastAsia" w:ascii="Times New Roman" w:hAnsi="Times New Roman" w:eastAsia="SimHei" w:cs="Times New Roman"/>
+          <w:lang w:eastAsia="zh-CN"/>
+        </w:rPr>
+        <w:t>）</w:t>
+      </w:r>
+      <w:r>
+        <w:rPr>
+          <w:rFonts w:hint="default" w:ascii="Times New Roman" w:hAnsi="Times New Roman" w:eastAsia="SimHei" w:cs="Times New Roman"/>
+        </w:rPr>
+        <w:t>为基线。该版本已经具备基础的登录鉴权、课题管理、文档提交、答辩安排、统计导出、AI 辅助和部分角色隔离能力。该版本对毕业设计核心流程的表达不够完整，选题流程主要停留在“学生申请 + 管理确认”或“一人一题审批”层面，三志愿、两轮、教师确认</w:t>
+      </w:r>
+      <w:bookmarkStart w:id="5" w:name="_GoBack"/>
+      <w:bookmarkEnd w:id="5"/>
+      <w:r>
+        <w:rPr>
+          <w:rFonts w:hint="default" w:ascii="Times New Roman" w:hAnsi="Times New Roman" w:eastAsia="SimHei" w:cs="Times New Roman"/>
+        </w:rPr>
+        <w:t>和流程控制体现不足。</w:t>
       </w:r>
     </w:p>
     <w:p>
@@ -1184,19 +1102,7 @@
               <w:rPr>
                 <w:rFonts w:hint="default" w:ascii="Times New Roman" w:hAnsi="Times New Roman" w:eastAsia="SimHei" w:cs="Times New Roman"/>
               </w:rPr>
-              <w:t>学生每轮</w:t>
-            </w:r>
-            <w:r>
-              <w:rPr>
-                <w:rFonts w:hint="default" w:ascii="Times New Roman" w:hAnsi="Times New Roman" w:eastAsia="SimHei" w:cs="Times New Roman"/>
-              </w:rPr>
-              <w:t xml:space="preserve"> 1-3 </w:t>
-            </w:r>
-            <w:r>
-              <w:rPr>
-                <w:rFonts w:hint="default" w:ascii="Times New Roman" w:hAnsi="Times New Roman" w:eastAsia="SimHei" w:cs="Times New Roman"/>
-              </w:rPr>
-              <w:t>个志愿、两轮填报</w:t>
+              <w:t>学生每轮 1-3 个志愿、两轮填报</w:t>
             </w:r>
           </w:p>
         </w:tc>
@@ -1302,19 +1208,7 @@
               <w:rPr>
                 <w:rFonts w:hint="default" w:ascii="Times New Roman" w:hAnsi="Times New Roman" w:eastAsia="SimHei" w:cs="Times New Roman"/>
               </w:rPr>
-              <w:t>增加每题每轮最多</w:t>
-            </w:r>
-            <w:r>
-              <w:rPr>
-                <w:rFonts w:hint="default" w:ascii="Times New Roman" w:hAnsi="Times New Roman" w:eastAsia="SimHei" w:cs="Times New Roman"/>
-              </w:rPr>
-              <w:t xml:space="preserve"> 3 </w:t>
-            </w:r>
-            <w:r>
-              <w:rPr>
-                <w:rFonts w:hint="default" w:ascii="Times New Roman" w:hAnsi="Times New Roman" w:eastAsia="SimHei" w:cs="Times New Roman"/>
-              </w:rPr>
-              <w:t>人意向限制</w:t>
+              <w:t>增加每题每轮最多 3 人意向限制</w:t>
             </w:r>
           </w:p>
         </w:tc>
@@ -1600,13 +1494,7 @@
               <w:rPr>
                 <w:rFonts w:hint="default" w:ascii="Times New Roman" w:hAnsi="Times New Roman" w:eastAsia="SimHei" w:cs="Times New Roman"/>
               </w:rPr>
-              <w:t>依赖旧</w:t>
-            </w:r>
-            <w:r>
-              <w:rPr>
-                <w:rFonts w:hint="default" w:ascii="Times New Roman" w:hAnsi="Times New Roman" w:eastAsia="SimHei" w:cs="Times New Roman"/>
-              </w:rPr>
-              <w:t xml:space="preserve"> </w:t>
+              <w:t xml:space="preserve">依赖旧 </w:t>
             </w:r>
             <w:r>
               <w:rPr>
@@ -1645,13 +1533,7 @@
               <w:rPr>
                 <w:rFonts w:hint="default" w:ascii="Times New Roman" w:hAnsi="Times New Roman" w:eastAsia="SimHei" w:cs="Times New Roman"/>
               </w:rPr>
-              <w:t>增加</w:t>
-            </w:r>
-            <w:r>
-              <w:rPr>
-                <w:rFonts w:hint="default" w:ascii="Times New Roman" w:hAnsi="Times New Roman" w:eastAsia="SimHei" w:cs="Times New Roman"/>
-              </w:rPr>
-              <w:t xml:space="preserve"> </w:t>
+              <w:t xml:space="preserve">增加 </w:t>
             </w:r>
             <w:r>
               <w:rPr>
@@ -1664,13 +1546,7 @@
               <w:rPr>
                 <w:rFonts w:hint="default" w:ascii="Times New Roman" w:hAnsi="Times New Roman" w:eastAsia="SimHei" w:cs="Times New Roman"/>
               </w:rPr>
-              <w:t xml:space="preserve"> </w:t>
-            </w:r>
-            <w:r>
-              <w:rPr>
-                <w:rFonts w:hint="default" w:ascii="Times New Roman" w:hAnsi="Times New Roman" w:eastAsia="SimHei" w:cs="Times New Roman"/>
-              </w:rPr>
-              <w:t>表统一承接最终结果</w:t>
+              <w:t xml:space="preserve"> 表统一承接最终结果</w:t>
             </w:r>
           </w:p>
         </w:tc>
@@ -2062,19 +1938,7 @@
               <w:rPr>
                 <w:rFonts w:hint="default" w:ascii="Times New Roman" w:hAnsi="Times New Roman" w:eastAsia="SimHei" w:cs="Times New Roman"/>
               </w:rPr>
-              <w:t>“终稿分</w:t>
-            </w:r>
-            <w:r>
-              <w:rPr>
-                <w:rFonts w:hint="default" w:ascii="Times New Roman" w:hAnsi="Times New Roman" w:eastAsia="SimHei" w:cs="Times New Roman"/>
-              </w:rPr>
-              <w:t xml:space="preserve"> + </w:t>
-            </w:r>
-            <w:r>
-              <w:rPr>
-                <w:rFonts w:hint="default" w:ascii="Times New Roman" w:hAnsi="Times New Roman" w:eastAsia="SimHei" w:cs="Times New Roman"/>
-              </w:rPr>
-              <w:t>答辩分”组合</w:t>
+              <w:t>“终稿分 + 答辩分”组合</w:t>
             </w:r>
           </w:p>
         </w:tc>
@@ -2106,37 +1970,7 @@
               <w:rPr>
                 <w:rFonts w:hint="default" w:ascii="Times New Roman" w:hAnsi="Times New Roman" w:eastAsia="SimHei" w:cs="Times New Roman"/>
               </w:rPr>
-              <w:t>指导教师</w:t>
-            </w:r>
-            <w:r>
-              <w:rPr>
-                <w:rFonts w:hint="default" w:ascii="Times New Roman" w:hAnsi="Times New Roman" w:eastAsia="SimHei" w:cs="Times New Roman"/>
-              </w:rPr>
-              <w:t xml:space="preserve"> </w:t>
-            </w:r>
-            <w:r>
-              <w:rPr>
-                <w:rFonts w:hint="default" w:ascii="Times New Roman" w:hAnsi="Times New Roman" w:eastAsia="SimHei" w:cs="Times New Roman"/>
-              </w:rPr>
-              <w:t>40%、评阅教师</w:t>
-            </w:r>
-            <w:r>
-              <w:rPr>
-                <w:rFonts w:hint="default" w:ascii="Times New Roman" w:hAnsi="Times New Roman" w:eastAsia="SimHei" w:cs="Times New Roman"/>
-              </w:rPr>
-              <w:t xml:space="preserve"> </w:t>
-            </w:r>
-            <w:r>
-              <w:rPr>
-                <w:rFonts w:hint="default" w:ascii="Times New Roman" w:hAnsi="Times New Roman" w:eastAsia="SimHei" w:cs="Times New Roman"/>
-              </w:rPr>
-              <w:t>20%、答辩</w:t>
-            </w:r>
-            <w:r>
-              <w:rPr>
-                <w:rFonts w:hint="default" w:ascii="Times New Roman" w:hAnsi="Times New Roman" w:eastAsia="SimHei" w:cs="Times New Roman"/>
-              </w:rPr>
-              <w:t xml:space="preserve"> 40%</w:t>
+              <w:t>指导教师 40%、评阅教师 20%、答辩 40%</w:t>
             </w:r>
           </w:p>
         </w:tc>
@@ -2210,25 +2044,7 @@
               <w:rPr>
                 <w:rFonts w:hint="default" w:ascii="Times New Roman" w:hAnsi="Times New Roman" w:eastAsia="SimHei" w:cs="Times New Roman"/>
               </w:rPr>
-              <w:t xml:space="preserve">AI </w:t>
-            </w:r>
-            <w:r>
-              <w:rPr>
-                <w:rFonts w:hint="default" w:ascii="Times New Roman" w:hAnsi="Times New Roman" w:eastAsia="SimHei" w:cs="Times New Roman"/>
-              </w:rPr>
-              <w:t>和</w:t>
-            </w:r>
-            <w:r>
-              <w:rPr>
-                <w:rFonts w:hint="default" w:ascii="Times New Roman" w:hAnsi="Times New Roman" w:eastAsia="SimHei" w:cs="Times New Roman"/>
-              </w:rPr>
-              <w:t xml:space="preserve"> Session </w:t>
-            </w:r>
-            <w:r>
-              <w:rPr>
-                <w:rFonts w:hint="default" w:ascii="Times New Roman" w:hAnsi="Times New Roman" w:eastAsia="SimHei" w:cs="Times New Roman"/>
-              </w:rPr>
-              <w:t>安全为主要关键模块</w:t>
+              <w:t>AI 和 Session 安全为主要关键模块</w:t>
             </w:r>
           </w:p>
         </w:tc>
@@ -2313,31 +2129,7 @@
         <w:rPr>
           <w:rFonts w:hint="default" w:ascii="Times New Roman" w:hAnsi="Times New Roman" w:eastAsia="SimHei" w:cs="Times New Roman"/>
         </w:rPr>
-        <w:t>新增学生端</w:t>
-      </w:r>
-      <w:r>
-        <w:rPr>
-          <w:rFonts w:hint="default" w:ascii="Times New Roman" w:hAnsi="Times New Roman" w:eastAsia="SimHei" w:cs="Times New Roman"/>
-        </w:rPr>
-        <w:t xml:space="preserve"> 1-3 </w:t>
-      </w:r>
-      <w:r>
-        <w:rPr>
-          <w:rFonts w:hint="default" w:ascii="Times New Roman" w:hAnsi="Times New Roman" w:eastAsia="SimHei" w:cs="Times New Roman"/>
-        </w:rPr>
-        <w:t>志愿填报及每题每轮最多</w:t>
-      </w:r>
-      <w:r>
-        <w:rPr>
-          <w:rFonts w:hint="default" w:ascii="Times New Roman" w:hAnsi="Times New Roman" w:eastAsia="SimHei" w:cs="Times New Roman"/>
-        </w:rPr>
-        <w:t xml:space="preserve"> 3 </w:t>
-      </w:r>
-      <w:r>
-        <w:rPr>
-          <w:rFonts w:hint="default" w:ascii="Times New Roman" w:hAnsi="Times New Roman" w:eastAsia="SimHei" w:cs="Times New Roman"/>
-        </w:rPr>
-        <w:t>个意向学生限制。</w:t>
+        <w:t>新增学生端 1-3 志愿填报及每题每轮最多 3 个意向学生限制。</w:t>
       </w:r>
     </w:p>
     <w:p>
@@ -2427,37 +2219,7 @@
         <w:rPr>
           <w:rFonts w:hint="default" w:ascii="Times New Roman" w:hAnsi="Times New Roman" w:eastAsia="SimHei" w:cs="Times New Roman"/>
         </w:rPr>
-        <w:t>修改学生成绩页和导出逻辑，统一为指导教师</w:t>
-      </w:r>
-      <w:r>
-        <w:rPr>
-          <w:rFonts w:hint="default" w:ascii="Times New Roman" w:hAnsi="Times New Roman" w:eastAsia="SimHei" w:cs="Times New Roman"/>
-        </w:rPr>
-        <w:t xml:space="preserve"> </w:t>
-      </w:r>
-      <w:r>
-        <w:rPr>
-          <w:rFonts w:hint="default" w:ascii="Times New Roman" w:hAnsi="Times New Roman" w:eastAsia="SimHei" w:cs="Times New Roman"/>
-        </w:rPr>
-        <w:t>40%、评阅教师</w:t>
-      </w:r>
-      <w:r>
-        <w:rPr>
-          <w:rFonts w:hint="default" w:ascii="Times New Roman" w:hAnsi="Times New Roman" w:eastAsia="SimHei" w:cs="Times New Roman"/>
-        </w:rPr>
-        <w:t xml:space="preserve"> </w:t>
-      </w:r>
-      <w:r>
-        <w:rPr>
-          <w:rFonts w:hint="default" w:ascii="Times New Roman" w:hAnsi="Times New Roman" w:eastAsia="SimHei" w:cs="Times New Roman"/>
-        </w:rPr>
-        <w:t>20%、答辩</w:t>
-      </w:r>
-      <w:r>
-        <w:rPr>
-          <w:rFonts w:hint="default" w:ascii="Times New Roman" w:hAnsi="Times New Roman" w:eastAsia="SimHei" w:cs="Times New Roman"/>
-        </w:rPr>
-        <w:t xml:space="preserve"> 40%。</w:t>
+        <w:t>修改学生成绩页和导出逻辑，统一为指导教师 40%、评阅教师 20%、答辩 40%。</w:t>
       </w:r>
     </w:p>
     <w:p>
@@ -2487,8 +2249,6 @@
         </w:rPr>
       </w:pPr>
       <w:bookmarkStart w:id="4" w:name="四本次报告写作重点"/>
-      <w:bookmarkStart w:id="5" w:name="_GoBack"/>
-      <w:bookmarkEnd w:id="5"/>
     </w:p>
     <w:bookmarkEnd w:id="0"/>
     <w:bookmarkEnd w:id="4"/>
@@ -2885,7 +2645,7 @@
   <w:docDefaults>
     <w:rPrDefault>
       <w:rPr>
-        <w:rFonts w:asciiTheme="minorHAnsi" w:hAnsiTheme="minorHAnsi" w:eastAsiaTheme="minorHAnsi" w:cstheme="minorBidi"/>
+        <w:rFonts w:ascii="Times New Roman" w:hAnsi="Times New Roman" w:eastAsia="SimSun" w:cs="Times New Roman"/>
       </w:rPr>
     </w:rPrDefault>
     <w:pPrDefault/>
@@ -2994,7 +2754,7 @@
     <w:lsdException w:unhideWhenUsed="0" w:uiPriority="0" w:semiHidden="0" w:name="HTML Sample"/>
     <w:lsdException w:unhideWhenUsed="0" w:uiPriority="0" w:semiHidden="0" w:name="HTML Typewriter"/>
     <w:lsdException w:unhideWhenUsed="0" w:uiPriority="0" w:semiHidden="0" w:name="HTML Variable"/>
-    <w:lsdException w:unhideWhenUsed="0" w:uiPriority="0" w:semiHidden="0" w:name="Normal Table"/>
+    <w:lsdException w:qFormat="1" w:unhideWhenUsed="0" w:uiPriority="0" w:semiHidden="0" w:name="Normal Table"/>
     <w:lsdException w:unhideWhenUsed="0" w:uiPriority="0" w:semiHidden="0" w:name="annotation subject"/>
     <w:lsdException w:unhideWhenUsed="0" w:uiPriority="0" w:semiHidden="0" w:name="Table Simple 1"/>
     <w:lsdException w:unhideWhenUsed="0" w:uiPriority="0" w:semiHidden="0" w:name="Table Simple 2"/>
@@ -3353,6 +3113,7 @@
   </w:style>
   <w:style w:type="table" w:default="1" w:styleId="18">
     <w:name w:val="Normal Table"/>
+    <w:qFormat/>
     <w:uiPriority w:val="0"/>
     <w:tblPr>
       <w:tblCellMar>
@@ -3496,6 +3257,7 @@
     <w:name w:val="Title Char"/>
     <w:basedOn w:val="19"/>
     <w:link w:val="15"/>
+    <w:qFormat/>
     <w:uiPriority w:val="10"/>
     <w:rPr>
       <w:rFonts w:asciiTheme="majorHAnsi" w:hAnsiTheme="majorHAnsi" w:eastAsiaTheme="majorEastAsia" w:cstheme="majorBidi"/>
@@ -3714,7 +3476,6 @@
       </w:tblCellMar>
     </w:tblPr>
     <w:tblStylePr w:type="firstRow">
-      <w:tblPr/>
       <w:tcPr>
         <w:tcBorders>
           <w:bottom w:val="single" w:color="auto" w:sz="0" w:space="0"/>

</xml_diff>